<commit_message>
refactor(tts): 优化 TTS 架构和 Wife 指令
- 使用本地部署方式进行GSVI的TTS推理并恢复Tts指令
- 修复 切换语音模式时清除记忆
- 修复 CQ提示词导致语音包含CQ的问题
- 修复 群提示词长时记忆未格式化的疏漏
- 优化 TtsClient 结构 - 拆分请求响应类并使用 RestClient
- 优化 Wife 指令 - 添加用户 AT 反馈
- 优化 Tts 指令
</commit_message>
<xml_diff>
--- a/src/main/resources/static/help/help.docx
+++ b/src/main/resources/static/help/help.docx
@@ -1537,6 +1537,7 @@
                 <w:bCs/>
                 <w:sz w:val="20"/>
                 <w:szCs w:val="20"/>
+                <w:u w:val="double"/>
               </w:rPr>
               <w:t>Tts</w:t>
             </w:r>
@@ -1554,7 +1555,23 @@
                 <w:sz w:val="20"/>
                 <w:szCs w:val="20"/>
               </w:rPr>
-              <w:t xml:space="preserve">          </w:t>
+              <w:t xml:space="preserve"> </w:t>
+            </w:r>
+            <w:r>
+              <w:rPr>
+                <w:rFonts w:hint="eastAsia"/>
+                <w:sz w:val="20"/>
+                <w:szCs w:val="20"/>
+              </w:rPr>
+              <w:t xml:space="preserve">        </w:t>
+            </w:r>
+            <w:r>
+              <w:rPr>
+                <w:rFonts w:hint="eastAsia"/>
+                <w:sz w:val="20"/>
+                <w:szCs w:val="20"/>
+              </w:rPr>
+              <w:t xml:space="preserve"> </w:t>
             </w:r>
             <w:r>
               <w:rPr>
@@ -1565,7 +1582,29 @@
                 <w:sz w:val="20"/>
                 <w:szCs w:val="20"/>
               </w:rPr>
-              <w:t>[API失效]</w:t>
+              <w:t>[</w:t>
+            </w:r>
+            <w:r>
+              <w:rPr>
+                <w:rFonts w:hint="eastAsia"/>
+                <w:b/>
+                <w:bCs/>
+                <w:color w:val="EE0000"/>
+                <w:sz w:val="20"/>
+                <w:szCs w:val="20"/>
+              </w:rPr>
+              <w:t xml:space="preserve">Local </w:t>
+            </w:r>
+            <w:r>
+              <w:rPr>
+                <w:rFonts w:hint="eastAsia"/>
+                <w:b/>
+                <w:bCs/>
+                <w:color w:val="EE0000"/>
+                <w:sz w:val="20"/>
+                <w:szCs w:val="20"/>
+              </w:rPr>
+              <w:t>API]</w:t>
             </w:r>
           </w:p>
         </w:tc>
@@ -6781,7 +6820,15 @@
           <w:sz w:val="20"/>
           <w:szCs w:val="20"/>
         </w:rPr>
-        <w:t>11</w:t>
+        <w:t>1</w:t>
+      </w:r>
+      <w:r>
+        <w:rPr>
+          <w:rFonts w:hint="eastAsia"/>
+          <w:sz w:val="20"/>
+          <w:szCs w:val="20"/>
+        </w:rPr>
+        <w:t>4</w:t>
       </w:r>
     </w:p>
     <w:sectPr>

</xml_diff>